<commit_message>
feat: migrate application database to sqlite
</commit_message>
<xml_diff>
--- a/Models/_Racine-Actifs/2026-03_Contrat-Domiciliation_Template.docx
+++ b/Models/_Racine-Actifs/2026-03_Contrat-Domiciliation_Template.docx
@@ -746,7 +746,103 @@
           <w:szCs w:val="14"/>
           <w:lang w:val="fr-FR"/>
         </w:rPr>
-        <w:t>« {{ DENOMINATION_SOCIALE }} {{ FORME_JURIDIQUE }} »</w:t>
+        <w:t xml:space="preserve">« </w:t>
+      </w:r>
+      <w:proofErr w:type="gramStart"/>
+      <w:r>
+        <w:rPr>
+          <w:b/>
+          <w:bCs/>
+          <w:color w:val="002060"/>
+          <w:sz w:val="14"/>
+          <w:szCs w:val="14"/>
+          <w:lang w:val="fr-FR"/>
+        </w:rPr>
+        <w:t>{{ DENOMINATION</w:t>
+      </w:r>
+      <w:proofErr w:type="gramEnd"/>
+      <w:r>
+        <w:rPr>
+          <w:b/>
+          <w:bCs/>
+          <w:color w:val="002060"/>
+          <w:sz w:val="14"/>
+          <w:szCs w:val="14"/>
+          <w:lang w:val="fr-FR"/>
+        </w:rPr>
+        <w:t>_</w:t>
+      </w:r>
+      <w:proofErr w:type="gramStart"/>
+      <w:r>
+        <w:rPr>
+          <w:b/>
+          <w:bCs/>
+          <w:color w:val="002060"/>
+          <w:sz w:val="14"/>
+          <w:szCs w:val="14"/>
+          <w:lang w:val="fr-FR"/>
+        </w:rPr>
+        <w:t>SOCIALE }</w:t>
+      </w:r>
+      <w:proofErr w:type="gramEnd"/>
+      <w:r>
+        <w:rPr>
+          <w:b/>
+          <w:bCs/>
+          <w:color w:val="002060"/>
+          <w:sz w:val="14"/>
+          <w:szCs w:val="14"/>
+          <w:lang w:val="fr-FR"/>
+        </w:rPr>
+        <w:t xml:space="preserve">} </w:t>
+      </w:r>
+      <w:proofErr w:type="gramStart"/>
+      <w:r>
+        <w:rPr>
+          <w:b/>
+          <w:bCs/>
+          <w:color w:val="002060"/>
+          <w:sz w:val="14"/>
+          <w:szCs w:val="14"/>
+          <w:lang w:val="fr-FR"/>
+        </w:rPr>
+        <w:t>{{ FORME</w:t>
+      </w:r>
+      <w:proofErr w:type="gramEnd"/>
+      <w:r>
+        <w:rPr>
+          <w:b/>
+          <w:bCs/>
+          <w:color w:val="002060"/>
+          <w:sz w:val="14"/>
+          <w:szCs w:val="14"/>
+          <w:lang w:val="fr-FR"/>
+        </w:rPr>
+        <w:t>_</w:t>
+      </w:r>
+      <w:proofErr w:type="gramStart"/>
+      <w:r>
+        <w:rPr>
+          <w:b/>
+          <w:bCs/>
+          <w:color w:val="002060"/>
+          <w:sz w:val="14"/>
+          <w:szCs w:val="14"/>
+          <w:lang w:val="fr-FR"/>
+        </w:rPr>
+        <w:t>JURIDIQUE }</w:t>
+      </w:r>
+      <w:proofErr w:type="gramEnd"/>
+      <w:r>
+        <w:rPr>
+          <w:b/>
+          <w:bCs/>
+          <w:color w:val="002060"/>
+          <w:sz w:val="14"/>
+          <w:szCs w:val="14"/>
+          <w:lang w:val="fr-FR"/>
+        </w:rPr>
+        <w:t>} »</w:t>
       </w:r>
       <w:r>
         <w:rPr>
@@ -825,6 +921,7 @@
         </w:rPr>
         <w:t xml:space="preserve">N° </w:t>
       </w:r>
+      <w:proofErr w:type="gramStart"/>
       <w:r>
         <w:rPr>
           <w:b/>
@@ -834,7 +931,43 @@
           <w:szCs w:val="14"/>
           <w:lang w:val="fr-FR"/>
         </w:rPr>
-        <w:t>{{ NUMERO_ICE }}</w:t>
+        <w:t>{{ NUMERO</w:t>
+      </w:r>
+      <w:proofErr w:type="gramEnd"/>
+      <w:r>
+        <w:rPr>
+          <w:b/>
+          <w:bCs/>
+          <w:color w:val="002060"/>
+          <w:sz w:val="14"/>
+          <w:szCs w:val="14"/>
+          <w:lang w:val="fr-FR"/>
+        </w:rPr>
+        <w:t>_</w:t>
+      </w:r>
+      <w:proofErr w:type="gramStart"/>
+      <w:r>
+        <w:rPr>
+          <w:b/>
+          <w:bCs/>
+          <w:color w:val="002060"/>
+          <w:sz w:val="14"/>
+          <w:szCs w:val="14"/>
+          <w:lang w:val="fr-FR"/>
+        </w:rPr>
+        <w:t>ICE }</w:t>
+      </w:r>
+      <w:proofErr w:type="gramEnd"/>
+      <w:r>
+        <w:rPr>
+          <w:b/>
+          <w:bCs/>
+          <w:color w:val="002060"/>
+          <w:sz w:val="14"/>
+          <w:szCs w:val="14"/>
+          <w:lang w:val="fr-FR"/>
+        </w:rPr>
+        <w:t>}</w:t>
       </w:r>
       <w:r>
         <w:rPr>
@@ -971,13 +1104,83 @@
                 <w:lang w:val="fr-FR"/>
               </w:rPr>
             </w:pPr>
+            <w:proofErr w:type="gramStart"/>
             <w:r>
               <w:rPr>
                 <w:sz w:val="14"/>
                 <w:szCs w:val="14"/>
                 <w:lang w:val="fr-FR"/>
               </w:rPr>
-              <w:t>{{ DATE_NAISSANCE_ASSOCIE }}</w:t>
+              <w:t>{{ DATE</w:t>
+            </w:r>
+            <w:proofErr w:type="gramEnd"/>
+            <w:r>
+              <w:rPr>
+                <w:sz w:val="14"/>
+                <w:szCs w:val="14"/>
+                <w:lang w:val="fr-FR"/>
+              </w:rPr>
+              <w:t>_NAISSANCE_</w:t>
+            </w:r>
+            <w:proofErr w:type="gramStart"/>
+            <w:r>
+              <w:rPr>
+                <w:sz w:val="14"/>
+                <w:szCs w:val="14"/>
+                <w:lang w:val="fr-FR"/>
+              </w:rPr>
+              <w:t>ASSOCIE }</w:t>
+            </w:r>
+            <w:proofErr w:type="gramEnd"/>
+            <w:r>
+              <w:rPr>
+                <w:sz w:val="14"/>
+                <w:szCs w:val="14"/>
+                <w:lang w:val="fr-FR"/>
+              </w:rPr>
+              <w:t>}</w:t>
+            </w:r>
+            <w:r>
+              <w:rPr>
+                <w:sz w:val="14"/>
+                <w:szCs w:val="14"/>
+                <w:lang w:val="fr-FR"/>
+              </w:rPr>
+              <w:t xml:space="preserve"> à </w:t>
+            </w:r>
+            <w:proofErr w:type="gramStart"/>
+            <w:r>
+              <w:rPr>
+                <w:sz w:val="14"/>
+                <w:szCs w:val="14"/>
+                <w:lang w:val="fr-FR"/>
+              </w:rPr>
+              <w:t xml:space="preserve">{{ </w:t>
+            </w:r>
+            <w:r>
+              <w:rPr>
+                <w:sz w:val="14"/>
+                <w:szCs w:val="14"/>
+                <w:lang w:val="fr-FR"/>
+              </w:rPr>
+              <w:t>LIEU</w:t>
+            </w:r>
+            <w:proofErr w:type="gramEnd"/>
+            <w:r>
+              <w:rPr>
+                <w:sz w:val="14"/>
+                <w:szCs w:val="14"/>
+                <w:lang w:val="fr-FR"/>
+              </w:rPr>
+              <w:t>_</w:t>
+            </w:r>
+            <w:r>
+              <w:rPr>
+                <w:sz w:val="14"/>
+                <w:szCs w:val="14"/>
+                <w:lang w:val="fr-FR"/>
+              </w:rPr>
+              <w:t>NAISSANCE_ASSOCIE }}</w:t>
             </w:r>
           </w:p>
         </w:tc>
@@ -1823,7 +2026,15 @@
           <w:szCs w:val="14"/>
           <w:lang w:val="fr-FR"/>
         </w:rPr>
-        <w:t>Tenu d'un dossier relatif à chaque personne domiciliée contenant des documents permettant, pour les personnes physiques de connaitre leurs adresses personnelles, leurs numéros de téléphone et leurs numéros de pièce d'identité ainsi que leurs adresses électroniques ;</w:t>
+        <w:t xml:space="preserve">Tenu d'un dossier relatif à chaque personne domiciliée contenant des documents permettant, pour les personnes physiques de connaitre leurs </w:t>
+      </w:r>
+      <w:r>
+        <w:rPr>
+          <w:sz w:val="14"/>
+          <w:szCs w:val="14"/>
+          <w:lang w:val="fr-FR"/>
+        </w:rPr>
+        <w:t>adresses personnelles, leurs numéros de téléphone et leurs numéros de pièce d'identité ainsi que leurs adresses électroniques ;</w:t>
       </w:r>
     </w:p>
     <w:p>
@@ -2375,6 +2586,7 @@
           <w:szCs w:val="14"/>
           <w:lang w:val="fr-FR"/>
         </w:rPr>
+        <w:lastRenderedPageBreak/>
         <w:t>Copie des documents d’identité du représentant légal</w:t>
       </w:r>
       <w:r>
@@ -2413,7 +2625,6 @@
           <w:szCs w:val="14"/>
           <w:lang w:val="fr-FR"/>
         </w:rPr>
-        <w:lastRenderedPageBreak/>
         <w:t>Extrait du compte ou spécimen de chèque ;</w:t>
       </w:r>
     </w:p>
@@ -2930,6 +3141,7 @@
         <w:rPr>
           <w:b/>
           <w:bCs/>
+          <w:color w:val="002060"/>
           <w:sz w:val="14"/>
           <w:szCs w:val="14"/>
           <w:lang w:val="fr-FR"/>
@@ -2940,38 +3152,206 @@
         <w:rPr>
           <w:b/>
           <w:bCs/>
-          <w:sz w:val="14"/>
-          <w:szCs w:val="14"/>
-          <w:lang w:val="fr-FR"/>
-        </w:rPr>
-        <w:t xml:space="preserve"> {{ PACK_DEMARRAGE_TOTAL_TTC}} DH TTC, soit un loyer mensuel de {{PACK_DEMARRAGE_LOYER_MENSUEL }} </w:t>
-      </w:r>
-      <w:r>
-        <w:rPr>
-          <w:b/>
-          <w:bCs/>
-          <w:sz w:val="14"/>
-          <w:szCs w:val="14"/>
-          <w:u w:val="single"/>
-          <w:lang w:val="fr-FR"/>
-        </w:rPr>
-        <w:t>DH TTC</w:t>
-      </w:r>
-      <w:r>
-        <w:rPr>
-          <w:sz w:val="14"/>
-          <w:szCs w:val="14"/>
-          <w:lang w:val="fr-FR"/>
-        </w:rPr>
-        <w:t>.</w:t>
-      </w:r>
-      <w:r>
-        <w:rPr>
+          <w:color w:val="002060"/>
           <w:sz w:val="14"/>
           <w:szCs w:val="14"/>
           <w:lang w:val="fr-FR"/>
         </w:rPr>
         <w:t xml:space="preserve"> </w:t>
+      </w:r>
+      <w:proofErr w:type="gramStart"/>
+      <w:r>
+        <w:rPr>
+          <w:b/>
+          <w:bCs/>
+          <w:color w:val="002060"/>
+          <w:sz w:val="14"/>
+          <w:szCs w:val="14"/>
+          <w:lang w:val="fr-FR"/>
+        </w:rPr>
+        <w:t>{{ PACK</w:t>
+      </w:r>
+      <w:proofErr w:type="gramEnd"/>
+      <w:r>
+        <w:rPr>
+          <w:b/>
+          <w:bCs/>
+          <w:color w:val="002060"/>
+          <w:sz w:val="14"/>
+          <w:szCs w:val="14"/>
+          <w:lang w:val="fr-FR"/>
+        </w:rPr>
+        <w:t>_DEMARRAGE_TOTAL_</w:t>
+      </w:r>
+      <w:proofErr w:type="gramStart"/>
+      <w:r>
+        <w:rPr>
+          <w:b/>
+          <w:bCs/>
+          <w:color w:val="002060"/>
+          <w:sz w:val="14"/>
+          <w:szCs w:val="14"/>
+          <w:lang w:val="fr-FR"/>
+        </w:rPr>
+        <w:t>TTC</w:t>
+      </w:r>
+      <w:r>
+        <w:rPr>
+          <w:b/>
+          <w:bCs/>
+          <w:color w:val="002060"/>
+          <w:sz w:val="14"/>
+          <w:szCs w:val="14"/>
+          <w:lang w:val="fr-FR"/>
+        </w:rPr>
+        <w:t xml:space="preserve"> </w:t>
+      </w:r>
+      <w:r>
+        <w:rPr>
+          <w:b/>
+          <w:bCs/>
+          <w:color w:val="002060"/>
+          <w:sz w:val="14"/>
+          <w:szCs w:val="14"/>
+          <w:lang w:val="fr-FR"/>
+        </w:rPr>
+        <w:t>}</w:t>
+      </w:r>
+      <w:proofErr w:type="gramEnd"/>
+      <w:r>
+        <w:rPr>
+          <w:b/>
+          <w:bCs/>
+          <w:color w:val="002060"/>
+          <w:sz w:val="14"/>
+          <w:szCs w:val="14"/>
+          <w:lang w:val="fr-FR"/>
+        </w:rPr>
+        <w:t>} D</w:t>
+      </w:r>
+      <w:r>
+        <w:rPr>
+          <w:b/>
+          <w:bCs/>
+          <w:color w:val="002060"/>
+          <w:sz w:val="14"/>
+          <w:szCs w:val="14"/>
+          <w:lang w:val="fr-FR"/>
+        </w:rPr>
+        <w:t>H</w:t>
+      </w:r>
+      <w:r>
+        <w:rPr>
+          <w:b/>
+          <w:bCs/>
+          <w:color w:val="002060"/>
+          <w:sz w:val="14"/>
+          <w:szCs w:val="14"/>
+          <w:lang w:val="fr-FR"/>
+        </w:rPr>
+        <w:t>,</w:t>
+      </w:r>
+      <w:r>
+        <w:rPr>
+          <w:b/>
+          <w:bCs/>
+          <w:sz w:val="14"/>
+          <w:szCs w:val="14"/>
+          <w:lang w:val="fr-FR"/>
+        </w:rPr>
+        <w:t xml:space="preserve"> soit un </w:t>
+      </w:r>
+      <w:r>
+        <w:rPr>
+          <w:b/>
+          <w:bCs/>
+          <w:color w:val="002060"/>
+          <w:sz w:val="14"/>
+          <w:szCs w:val="14"/>
+          <w:lang w:val="fr-FR"/>
+        </w:rPr>
+        <w:t xml:space="preserve">loyer mensuel de </w:t>
+      </w:r>
+      <w:proofErr w:type="gramStart"/>
+      <w:r>
+        <w:rPr>
+          <w:b/>
+          <w:bCs/>
+          <w:color w:val="002060"/>
+          <w:sz w:val="14"/>
+          <w:szCs w:val="14"/>
+          <w:lang w:val="fr-FR"/>
+        </w:rPr>
+        <w:t>{{</w:t>
+      </w:r>
+      <w:r>
+        <w:rPr>
+          <w:b/>
+          <w:bCs/>
+          <w:color w:val="002060"/>
+          <w:sz w:val="14"/>
+          <w:szCs w:val="14"/>
+          <w:lang w:val="fr-FR"/>
+        </w:rPr>
+        <w:t xml:space="preserve"> </w:t>
+      </w:r>
+      <w:r>
+        <w:rPr>
+          <w:b/>
+          <w:bCs/>
+          <w:color w:val="002060"/>
+          <w:sz w:val="14"/>
+          <w:szCs w:val="14"/>
+          <w:lang w:val="fr-FR"/>
+        </w:rPr>
+        <w:t>PACK</w:t>
+      </w:r>
+      <w:proofErr w:type="gramEnd"/>
+      <w:r>
+        <w:rPr>
+          <w:b/>
+          <w:bCs/>
+          <w:color w:val="002060"/>
+          <w:sz w:val="14"/>
+          <w:szCs w:val="14"/>
+          <w:lang w:val="fr-FR"/>
+        </w:rPr>
+        <w:t>_DEMARRAGE_LOYER_</w:t>
+      </w:r>
+      <w:proofErr w:type="gramStart"/>
+      <w:r>
+        <w:rPr>
+          <w:b/>
+          <w:bCs/>
+          <w:color w:val="002060"/>
+          <w:sz w:val="14"/>
+          <w:szCs w:val="14"/>
+          <w:lang w:val="fr-FR"/>
+        </w:rPr>
+        <w:t>MENSUEL }</w:t>
+      </w:r>
+      <w:proofErr w:type="gramEnd"/>
+      <w:r>
+        <w:rPr>
+          <w:b/>
+          <w:bCs/>
+          <w:color w:val="002060"/>
+          <w:sz w:val="14"/>
+          <w:szCs w:val="14"/>
+          <w:lang w:val="fr-FR"/>
+        </w:rPr>
+        <w:t xml:space="preserve">} </w:t>
+      </w:r>
+      <w:r>
+        <w:rPr>
+          <w:b/>
+          <w:bCs/>
+          <w:color w:val="002060"/>
+          <w:sz w:val="14"/>
+          <w:szCs w:val="14"/>
+          <w:lang w:val="fr-FR"/>
+        </w:rPr>
+        <w:t xml:space="preserve">DH. </w:t>
       </w:r>
       <w:r>
         <w:rPr>
@@ -3120,6 +3500,9 @@
         <w:spacing w:after="0"/>
         <w:jc w:val="both"/>
         <w:rPr>
+          <w:b/>
+          <w:bCs/>
+          <w:color w:val="002060"/>
           <w:sz w:val="14"/>
           <w:szCs w:val="14"/>
           <w:lang w:val="fr-FR"/>
@@ -3133,7 +3516,292 @@
         </w:rPr>
         <w:t xml:space="preserve">Le loyer de renouvellement est fixé à </w:t>
       </w:r>
-      <w:r>
+      <w:proofErr w:type="gramStart"/>
+      <w:r>
+        <w:rPr>
+          <w:b/>
+          <w:bCs/>
+          <w:color w:val="002060"/>
+          <w:sz w:val="14"/>
+          <w:szCs w:val="14"/>
+          <w:lang w:val="fr-FR"/>
+        </w:rPr>
+        <w:t>{{ RENOUVELLEMENT</w:t>
+      </w:r>
+      <w:proofErr w:type="gramEnd"/>
+      <w:r>
+        <w:rPr>
+          <w:b/>
+          <w:bCs/>
+          <w:color w:val="002060"/>
+          <w:sz w:val="14"/>
+          <w:szCs w:val="14"/>
+          <w:lang w:val="fr-FR"/>
+        </w:rPr>
+        <w:t>_LOYER_</w:t>
+      </w:r>
+      <w:proofErr w:type="gramStart"/>
+      <w:r>
+        <w:rPr>
+          <w:b/>
+          <w:bCs/>
+          <w:color w:val="002060"/>
+          <w:sz w:val="14"/>
+          <w:szCs w:val="14"/>
+          <w:lang w:val="fr-FR"/>
+        </w:rPr>
+        <w:t>MENSUEL</w:t>
+      </w:r>
+      <w:r>
+        <w:rPr>
+          <w:b/>
+          <w:bCs/>
+          <w:color w:val="002060"/>
+          <w:sz w:val="14"/>
+          <w:szCs w:val="14"/>
+          <w:lang w:val="fr-FR"/>
+        </w:rPr>
+        <w:t xml:space="preserve"> </w:t>
+      </w:r>
+      <w:r>
+        <w:rPr>
+          <w:b/>
+          <w:bCs/>
+          <w:color w:val="002060"/>
+          <w:sz w:val="14"/>
+          <w:szCs w:val="14"/>
+          <w:lang w:val="fr-FR"/>
+        </w:rPr>
+        <w:t>}</w:t>
+      </w:r>
+      <w:proofErr w:type="gramEnd"/>
+      <w:r>
+        <w:rPr>
+          <w:b/>
+          <w:bCs/>
+          <w:color w:val="002060"/>
+          <w:sz w:val="14"/>
+          <w:szCs w:val="14"/>
+          <w:lang w:val="fr-FR"/>
+        </w:rPr>
+        <w:t>} DH</w:t>
+      </w:r>
+      <w:r>
+        <w:rPr>
+          <w:sz w:val="14"/>
+          <w:szCs w:val="14"/>
+          <w:lang w:val="fr-FR"/>
+        </w:rPr>
+        <w:t xml:space="preserve"> par mois, portant le montant annuel à </w:t>
+      </w:r>
+      <w:proofErr w:type="gramStart"/>
+      <w:r>
+        <w:rPr>
+          <w:b/>
+          <w:bCs/>
+          <w:color w:val="002060"/>
+          <w:sz w:val="14"/>
+          <w:szCs w:val="14"/>
+          <w:lang w:val="fr-FR"/>
+        </w:rPr>
+        <w:t>{{</w:t>
+      </w:r>
+      <w:r>
+        <w:rPr>
+          <w:b/>
+          <w:bCs/>
+          <w:color w:val="002060"/>
+          <w:sz w:val="14"/>
+          <w:szCs w:val="14"/>
+          <w:lang w:val="fr-FR"/>
+        </w:rPr>
+        <w:t xml:space="preserve"> </w:t>
+      </w:r>
+      <w:r>
+        <w:rPr>
+          <w:b/>
+          <w:bCs/>
+          <w:color w:val="002060"/>
+          <w:sz w:val="14"/>
+          <w:szCs w:val="14"/>
+          <w:lang w:val="fr-FR"/>
+        </w:rPr>
+        <w:t>RENOUVELLEMENT</w:t>
+      </w:r>
+      <w:proofErr w:type="gramEnd"/>
+      <w:r>
+        <w:rPr>
+          <w:b/>
+          <w:bCs/>
+          <w:color w:val="002060"/>
+          <w:sz w:val="14"/>
+          <w:szCs w:val="14"/>
+          <w:lang w:val="fr-FR"/>
+        </w:rPr>
+        <w:t>_LOYER_</w:t>
+      </w:r>
+      <w:proofErr w:type="gramStart"/>
+      <w:r>
+        <w:rPr>
+          <w:b/>
+          <w:bCs/>
+          <w:color w:val="002060"/>
+          <w:sz w:val="14"/>
+          <w:szCs w:val="14"/>
+          <w:lang w:val="fr-FR"/>
+        </w:rPr>
+        <w:t>ANNUEL</w:t>
+      </w:r>
+      <w:r>
+        <w:rPr>
+          <w:b/>
+          <w:bCs/>
+          <w:color w:val="002060"/>
+          <w:sz w:val="14"/>
+          <w:szCs w:val="14"/>
+          <w:lang w:val="fr-FR"/>
+        </w:rPr>
+        <w:t xml:space="preserve"> </w:t>
+      </w:r>
+      <w:r>
+        <w:rPr>
+          <w:b/>
+          <w:bCs/>
+          <w:color w:val="002060"/>
+          <w:sz w:val="14"/>
+          <w:szCs w:val="14"/>
+          <w:lang w:val="fr-FR"/>
+        </w:rPr>
+        <w:t>}</w:t>
+      </w:r>
+      <w:proofErr w:type="gramEnd"/>
+      <w:r>
+        <w:rPr>
+          <w:b/>
+          <w:bCs/>
+          <w:color w:val="002060"/>
+          <w:sz w:val="14"/>
+          <w:szCs w:val="14"/>
+          <w:lang w:val="fr-FR"/>
+        </w:rPr>
+        <w:t>} DH</w:t>
+      </w:r>
+      <w:r>
+        <w:rPr>
+          <w:b/>
+          <w:bCs/>
+          <w:color w:val="002060"/>
+          <w:sz w:val="14"/>
+          <w:szCs w:val="14"/>
+          <w:lang w:val="fr-FR"/>
+        </w:rPr>
+        <w:t>.</w:t>
+      </w:r>
+    </w:p>
+    <w:p>
+      <w:pPr>
+        <w:spacing w:after="0"/>
+        <w:jc w:val="both"/>
+        <w:rPr>
+          <w:sz w:val="14"/>
+          <w:szCs w:val="14"/>
+          <w:lang w:val="fr-FR"/>
+        </w:rPr>
+      </w:pPr>
+      <w:r>
+        <w:rPr>
+          <w:sz w:val="14"/>
+          <w:szCs w:val="14"/>
+          <w:lang w:val="fr-FR"/>
+        </w:rPr>
+        <w:t>Le paiement annuel par anticipation payable en une seule échéance au début de chaque année contractuelle.</w:t>
+      </w:r>
+    </w:p>
+    <w:p>
+      <w:pPr>
+        <w:spacing w:after="0"/>
+        <w:jc w:val="both"/>
+        <w:rPr>
+          <w:sz w:val="14"/>
+          <w:szCs w:val="14"/>
+          <w:lang w:val="fr-FR"/>
+        </w:rPr>
+      </w:pPr>
+    </w:p>
+    <w:p>
+      <w:pPr>
+        <w:pStyle w:val="Paragraphedeliste"/>
+        <w:numPr>
+          <w:ilvl w:val="0"/>
+          <w:numId w:val="9"/>
+        </w:numPr>
+        <w:spacing w:after="0"/>
+        <w:jc w:val="both"/>
+        <w:rPr>
+          <w:b/>
+          <w:bCs/>
+          <w:sz w:val="14"/>
+          <w:szCs w:val="14"/>
+          <w:lang w:val="fr-FR"/>
+        </w:rPr>
+      </w:pPr>
+      <w:r>
+        <w:rPr>
+          <w:b/>
+          <w:bCs/>
+          <w:sz w:val="14"/>
+          <w:szCs w:val="14"/>
+          <w:lang w:val="fr-FR"/>
+        </w:rPr>
+        <w:t>Dispositions légales</w:t>
+      </w:r>
+    </w:p>
+    <w:p>
+      <w:pPr>
+        <w:spacing w:after="0"/>
+        <w:jc w:val="both"/>
+        <w:rPr>
+          <w:b/>
+          <w:bCs/>
+          <w:sz w:val="14"/>
+          <w:szCs w:val="14"/>
+          <w:lang w:val="fr-FR"/>
+        </w:rPr>
+      </w:pPr>
+    </w:p>
+    <w:p>
+      <w:pPr>
+        <w:spacing w:after="0"/>
+        <w:jc w:val="both"/>
+        <w:rPr>
+          <w:sz w:val="14"/>
+          <w:szCs w:val="14"/>
+          <w:lang w:val="fr-FR"/>
+        </w:rPr>
+      </w:pPr>
+      <w:r>
+        <w:rPr>
+          <w:sz w:val="14"/>
+          <w:szCs w:val="14"/>
+          <w:lang w:val="fr-FR"/>
+        </w:rPr>
+        <w:t xml:space="preserve">Toute modification des tarifs sera notifiée par écrit avec un préavis d’un </w:t>
+      </w:r>
+      <w:r>
+        <w:rPr>
+          <w:b/>
+          <w:bCs/>
+          <w:sz w:val="14"/>
+          <w:szCs w:val="14"/>
+          <w:lang w:val="fr-FR"/>
+        </w:rPr>
+        <w:t>(1) mois.</w:t>
+      </w:r>
+    </w:p>
+    <w:p>
+      <w:pPr>
+        <w:spacing w:after="0"/>
+        <w:jc w:val="both"/>
         <w:rPr>
           <w:b/>
           <w:bCs/>
@@ -3142,15 +3810,634 @@
           <w:u w:val="single"/>
           <w:lang w:val="fr-FR"/>
         </w:rPr>
-        <w:t>{{ RENOUVELLEMENT_LOYER_MENSUEL}} DH TTC par mois, portant le montant annuel à {{RENOUVELLEMENT_LOYER_ANNUEL}} DH TTC.Le paiement annuel par anticipation payable en une seule échéance au début de chaque année contractuelle.Dispositions légalesLes montants ci‑dessus sont établis conformément à la réglementation en vigueur et au taux normal de TVA applicable aux prestations de services, fixé à 20 %.Toute modification des tarifs sera notifiée par écrit avec un préavis d’un (1) mois.Le loyer inclut uniquement les services prévus dans le contrat, toute prestation supplémentaire sera facturée séparément.ARTICLE 6 : DECLARATIONLe signataire du présent contrat déclare, de manière expresse et sur l’honneur, Certifier l’exactitude des renseignements fournis à l’appui de la signature du présent contrat avec « CENTIRIO SARL », certifier ne pas être en situation de liquidation de biens, règlement judiciaire, en ce qui concerne l’entreprise ou les entreprises qu’il dirige, que ces établissements soient ou non l’objet dudit contrat.Enfin, il atteste de l’exactitude de tous les renseignements fournis à « CENTIRIO SARL », tant en ce qui concerne son état-civil que l’entreprise représentée.ARTICLE 7 : CLAUSE RESOLUTIONIl est expressément stipulé qu’à défaut de paiement d’une facture à son échéance ou en cas d’inexécution constatée d’une seule des obligations du contrat, huit jours après une lettre recommandée avec accusé de réception non suivie d’effet, le contrat sera résilié de plein droit.Le courrier du domicilié sera alors refusé et ses appels téléphoniques rejetés. La situation sera également signalée au Registre de Commerce de Casablanca et aux services fiscaux compétents.En  outre  «  CENTIRIO  SARL», se  réserve  la  faculté  de  faire  cesser  les effets des  contrats  dans  les  locaux  concernés  ainsi que tous les actes en découlant pour le domicilié, sur simple lettre recommandée avec accusé de réception avec effet immédiat dans le cas où le domicilié, créerait des troubles commerciaux ou non, pour la bonne marche et la bonne réputation des locaux et, de manière générales, tous usages contraires à l’ordre public et aux bonnes mœurs (défaut de paiement de ses fournisseurs ou tout créancier, plainte des salariés, action de l’inspection du travail, visite des services de police le  concernant  ou  visite d’huissiers à sa recherche,…). Tous les frais d’une telle situation et ceux qui en seraient la suite ou la conséquence seront à la charge du domicilié qui s’oblige à les régler.Le domicilié devra, en outre, rembourser à « CENTIRIO SARL », les frais des actes extra-judiciaires et autres frais de justice motivés par des infractions aux clauses et aux conditions du présent engagement.En application de ces principes et pour le cas où le recouvrement de toutes les sommes exigibles en vertu des présentes nécessiterait l’intervention d’un huissier de justice et/ou d’un avocat, le domicilié devra également rembourser à « CENTIRIO SARL », les honoraires et frais de recouvrement, droit de recette ou droit proportionnel qui seraient perçus par ceux-ci.ARTICLE 8 : FRAISLes frais et droits des présentes sont à la charge du domicilié.ARTICLE 9 : CLAUSE COMPROMISSOIREEn cas de contestation ou de litige quant à l’exécution des présentes, les Parties s’entendent pour rendre le Tribunal de Casablanca seul compétent.ARTICLE 10 : PROCURATION SPECIALE :{{CIVILITE_ASSOCIE }} {{ PRENOM_ASSOCIE }} {{ NOM_ASSOCIE }},</w:t>
-      </w:r>
-      <w:r>
-        <w:rPr>
+      </w:pPr>
+      <w:r>
+        <w:rPr>
+          <w:sz w:val="14"/>
+          <w:szCs w:val="14"/>
+          <w:lang w:val="fr-FR"/>
+        </w:rPr>
+        <w:t>Le loyer inclut uniquement les services prévus dans le contrat, toute prestation supplémentaire sera facturée séparément.</w:t>
+      </w:r>
+    </w:p>
+    <w:p>
+      <w:pPr>
+        <w:spacing w:after="0"/>
+        <w:jc w:val="both"/>
+        <w:rPr>
+          <w:b/>
+          <w:bCs/>
+          <w:sz w:val="14"/>
+          <w:szCs w:val="14"/>
+          <w:u w:val="single"/>
+          <w:lang w:val="fr-FR"/>
+        </w:rPr>
+      </w:pPr>
+    </w:p>
+    <w:p>
+      <w:pPr>
+        <w:jc w:val="both"/>
+        <w:rPr>
+          <w:b/>
+          <w:bCs/>
+          <w:sz w:val="14"/>
+          <w:szCs w:val="14"/>
+          <w:u w:val="single"/>
+          <w:lang w:val="fr-FR"/>
+        </w:rPr>
+      </w:pPr>
+      <w:r>
+        <w:rPr>
+          <w:b/>
+          <w:bCs/>
+          <w:sz w:val="14"/>
+          <w:szCs w:val="14"/>
+          <w:u w:val="single"/>
+          <w:lang w:val="fr-FR"/>
+        </w:rPr>
+        <w:t>A</w:t>
+      </w:r>
+      <w:r>
+        <w:rPr>
+          <w:b/>
+          <w:bCs/>
+          <w:sz w:val="14"/>
+          <w:szCs w:val="14"/>
+          <w:u w:val="single"/>
+          <w:lang w:val="fr-FR"/>
+        </w:rPr>
+        <w:t xml:space="preserve"> </w:t>
+      </w:r>
+      <w:r>
+        <w:rPr>
+          <w:b/>
+          <w:bCs/>
+          <w:sz w:val="14"/>
+          <w:szCs w:val="14"/>
+          <w:u w:val="single"/>
+          <w:lang w:val="fr-FR"/>
+        </w:rPr>
+        <w:t>ARTICLE 6 : DECLARATION</w:t>
+      </w:r>
+    </w:p>
+    <w:p>
+      <w:pPr>
+        <w:jc w:val="both"/>
+        <w:rPr>
+          <w:sz w:val="14"/>
+          <w:szCs w:val="14"/>
+          <w:lang w:val="fr-FR"/>
+        </w:rPr>
+      </w:pPr>
+      <w:r>
+        <w:rPr>
+          <w:sz w:val="14"/>
+          <w:szCs w:val="14"/>
+          <w:lang w:val="fr-FR"/>
+        </w:rPr>
+        <w:t xml:space="preserve">Le signataire du présent contrat déclare, de manière expresse et sur l’honneur, Certifier l’exactitude des renseignements fournis à l’appui de la signature du présent contrat avec </w:t>
+      </w:r>
+      <w:r>
+        <w:rPr>
+          <w:b/>
+          <w:bCs/>
+          <w:color w:val="32483B"/>
+          <w:sz w:val="14"/>
+          <w:szCs w:val="14"/>
+          <w:lang w:val="fr-FR"/>
+        </w:rPr>
+        <w:t xml:space="preserve">« </w:t>
+      </w:r>
+      <w:r>
+        <w:rPr>
+          <w:b/>
+          <w:bCs/>
+          <w:color w:val="32483B"/>
+          <w:sz w:val="14"/>
+          <w:szCs w:val="14"/>
+          <w:lang w:val="fr-FR"/>
+        </w:rPr>
+        <w:t>CENTIRIO SARLAU</w:t>
+      </w:r>
+      <w:r>
+        <w:rPr>
+          <w:b/>
+          <w:bCs/>
+          <w:color w:val="32483B"/>
+          <w:sz w:val="14"/>
+          <w:szCs w:val="14"/>
+          <w:lang w:val="fr-FR"/>
+        </w:rPr>
+        <w:t xml:space="preserve"> »</w:t>
+      </w:r>
+      <w:r>
+        <w:rPr>
+          <w:color w:val="32483B"/>
+          <w:sz w:val="14"/>
+          <w:szCs w:val="14"/>
+          <w:lang w:val="fr-FR"/>
+        </w:rPr>
+        <w:t xml:space="preserve">, </w:t>
+      </w:r>
+      <w:r>
+        <w:rPr>
+          <w:sz w:val="14"/>
+          <w:szCs w:val="14"/>
+          <w:lang w:val="fr-FR"/>
+        </w:rPr>
+        <w:t>certifier ne pas être en situation de liquidation de biens, règlement judiciaire, en ce qui concerne l’entreprise ou les entreprises qu’il dirige, que ces établissements soient ou non l’objet dudit contrat.</w:t>
+      </w:r>
+    </w:p>
+    <w:p>
+      <w:pPr>
+        <w:jc w:val="both"/>
+        <w:rPr>
+          <w:sz w:val="14"/>
+          <w:szCs w:val="14"/>
+          <w:lang w:val="fr-FR"/>
+        </w:rPr>
+      </w:pPr>
+      <w:r>
+        <w:rPr>
+          <w:sz w:val="14"/>
+          <w:szCs w:val="14"/>
+          <w:lang w:val="fr-FR"/>
+        </w:rPr>
+        <w:t xml:space="preserve">Enfin, il atteste de l’exactitude de tous les renseignements fournis à </w:t>
+      </w:r>
+      <w:r>
+        <w:rPr>
+          <w:b/>
+          <w:bCs/>
+          <w:color w:val="32483B"/>
+          <w:sz w:val="14"/>
+          <w:szCs w:val="14"/>
+          <w:lang w:val="fr-FR"/>
+        </w:rPr>
+        <w:t>«</w:t>
+      </w:r>
+      <w:r>
+        <w:rPr>
+          <w:b/>
+          <w:bCs/>
+          <w:color w:val="32483B"/>
+          <w:sz w:val="14"/>
+          <w:szCs w:val="14"/>
+          <w:lang w:val="fr-FR"/>
+        </w:rPr>
+        <w:t xml:space="preserve"> CENTIRIO SARLAU</w:t>
+      </w:r>
+      <w:r>
+        <w:rPr>
+          <w:b/>
+          <w:bCs/>
+          <w:color w:val="32483B"/>
+          <w:sz w:val="14"/>
+          <w:szCs w:val="14"/>
+          <w:lang w:val="fr-FR"/>
+        </w:rPr>
+        <w:t xml:space="preserve"> »</w:t>
+      </w:r>
+      <w:r>
+        <w:rPr>
+          <w:sz w:val="14"/>
+          <w:szCs w:val="14"/>
+          <w:lang w:val="fr-FR"/>
+        </w:rPr>
+        <w:t>, tant en ce qui concerne son état-civil que l’entreprise représentée.</w:t>
+      </w:r>
+    </w:p>
+    <w:p>
+      <w:pPr>
+        <w:jc w:val="both"/>
+        <w:rPr>
+          <w:b/>
+          <w:bCs/>
+          <w:sz w:val="14"/>
+          <w:szCs w:val="14"/>
+          <w:u w:val="single"/>
+          <w:lang w:val="fr-FR"/>
+        </w:rPr>
+      </w:pPr>
+      <w:r>
+        <w:rPr>
+          <w:b/>
+          <w:bCs/>
+          <w:sz w:val="14"/>
+          <w:szCs w:val="14"/>
+          <w:u w:val="single"/>
+          <w:lang w:val="fr-FR"/>
+        </w:rPr>
+        <w:t>ARTICLE 7 : CLAUSE RESOLUTION</w:t>
+      </w:r>
+    </w:p>
+    <w:p>
+      <w:pPr>
+        <w:jc w:val="both"/>
+        <w:rPr>
+          <w:sz w:val="14"/>
+          <w:szCs w:val="14"/>
+          <w:lang w:val="fr-FR"/>
+        </w:rPr>
+      </w:pPr>
+      <w:r>
+        <w:rPr>
+          <w:sz w:val="14"/>
+          <w:szCs w:val="14"/>
+          <w:lang w:val="fr-FR"/>
+        </w:rPr>
+        <w:t xml:space="preserve">Il est expressément stipulé qu’à défaut de paiement d’une facture à son échéance ou en cas d’inexécution constatée d’une seule des obligations du contrat, </w:t>
+      </w:r>
+      <w:r>
+        <w:rPr>
+          <w:b/>
+          <w:bCs/>
+          <w:sz w:val="14"/>
+          <w:szCs w:val="14"/>
+          <w:u w:val="single"/>
+          <w:lang w:val="fr-FR"/>
+        </w:rPr>
+        <w:t xml:space="preserve">huit jours après une lettre recommandée </w:t>
+      </w:r>
+      <w:r>
+        <w:rPr>
+          <w:sz w:val="14"/>
+          <w:szCs w:val="14"/>
+          <w:lang w:val="fr-FR"/>
+        </w:rPr>
+        <w:t>avec accusé de réception non suivie d’effet, le contrat sera résilié de plein droit.</w:t>
+      </w:r>
+    </w:p>
+    <w:p>
+      <w:pPr>
+        <w:jc w:val="both"/>
+        <w:rPr>
+          <w:sz w:val="14"/>
+          <w:szCs w:val="14"/>
+          <w:lang w:val="fr-FR"/>
+        </w:rPr>
+      </w:pPr>
+      <w:r>
+        <w:rPr>
+          <w:sz w:val="14"/>
+          <w:szCs w:val="14"/>
+          <w:lang w:val="fr-FR"/>
+        </w:rPr>
+        <w:t>Le courrier du domicilié sera alors refusé et ses appels téléphoniques rejetés. La situation sera également signalée au Registre de Commerce de Casablanca et aux services fiscaux compétents.</w:t>
+      </w:r>
+    </w:p>
+    <w:p>
+      <w:pPr>
+        <w:jc w:val="both"/>
+        <w:rPr>
+          <w:sz w:val="14"/>
+          <w:szCs w:val="14"/>
+          <w:lang w:val="fr-FR"/>
+        </w:rPr>
+      </w:pPr>
+      <w:r>
+        <w:rPr>
+          <w:sz w:val="14"/>
+          <w:szCs w:val="14"/>
+          <w:lang w:val="fr-FR"/>
+        </w:rPr>
+        <w:t xml:space="preserve">En  outre  </w:t>
+      </w:r>
+      <w:r>
+        <w:rPr>
+          <w:b/>
+          <w:bCs/>
+          <w:color w:val="32483B"/>
+          <w:sz w:val="14"/>
+          <w:szCs w:val="14"/>
+          <w:lang w:val="fr-FR"/>
+        </w:rPr>
+        <w:t>« CENTIRIO  SARLAU »</w:t>
+      </w:r>
+      <w:r>
+        <w:rPr>
+          <w:color w:val="32483B"/>
+          <w:sz w:val="14"/>
+          <w:szCs w:val="14"/>
+          <w:lang w:val="fr-FR"/>
+        </w:rPr>
+        <w:t xml:space="preserve">, </w:t>
+      </w:r>
+      <w:r>
+        <w:rPr>
+          <w:sz w:val="14"/>
+          <w:szCs w:val="14"/>
+          <w:lang w:val="fr-FR"/>
+        </w:rPr>
+        <w:t>se  réserve  la  faculté  de  faire  cesser  les effets des  contrats  dans  les  locaux  concernés  ainsi que tous les actes en découlant pour le domicilié, sur simple lettre recommandée avec accusé de réception avec effet immédiat dans le cas où le domicilié, créerait des troubles commerciaux ou non, pour la bonne marche et la bonne réputation des locaux et, de manière générales, tous usages contraires à l’ordre public et aux bonnes mœurs (défaut de paiement de ses fournisseurs ou tout créancier, plainte des salariés, action de l’inspection du travail, visite des services de police le  concernant  ou  visite d’huissiers à sa recherche,…). Tous les frais d’une telle situation et ceux qui en seraient la suite ou la conséquence seront à la charge du domicilié qui s’oblige à les régler.</w:t>
+      </w:r>
+    </w:p>
+    <w:p>
+      <w:pPr>
+        <w:jc w:val="both"/>
+        <w:rPr>
+          <w:sz w:val="14"/>
+          <w:szCs w:val="14"/>
+          <w:lang w:val="fr-FR"/>
+        </w:rPr>
+      </w:pPr>
+      <w:r>
+        <w:rPr>
+          <w:sz w:val="14"/>
+          <w:szCs w:val="14"/>
+          <w:lang w:val="fr-FR"/>
+        </w:rPr>
+        <w:t xml:space="preserve">Le domicilié devra, en outre, rembourser à </w:t>
+      </w:r>
+      <w:r>
+        <w:rPr>
+          <w:b/>
+          <w:bCs/>
+          <w:color w:val="32483B"/>
+          <w:sz w:val="14"/>
+          <w:szCs w:val="14"/>
+          <w:lang w:val="fr-FR"/>
+        </w:rPr>
+        <w:t xml:space="preserve">« </w:t>
+      </w:r>
+      <w:r>
+        <w:rPr>
+          <w:b/>
+          <w:bCs/>
+          <w:color w:val="32483B"/>
+          <w:sz w:val="14"/>
+          <w:szCs w:val="14"/>
+          <w:lang w:val="fr-FR"/>
+        </w:rPr>
+        <w:t>CENTIRIO SARLAU</w:t>
+      </w:r>
+      <w:r>
+        <w:rPr>
+          <w:b/>
+          <w:bCs/>
+          <w:color w:val="32483B"/>
+          <w:sz w:val="14"/>
+          <w:szCs w:val="14"/>
+          <w:lang w:val="fr-FR"/>
+        </w:rPr>
+        <w:t xml:space="preserve"> »</w:t>
+      </w:r>
+      <w:r>
+        <w:rPr>
+          <w:color w:val="124F1A" w:themeColor="accent3" w:themeShade="BF"/>
+          <w:sz w:val="14"/>
+          <w:szCs w:val="14"/>
+          <w:lang w:val="fr-FR"/>
+        </w:rPr>
+        <w:t xml:space="preserve">, </w:t>
+      </w:r>
+      <w:r>
+        <w:rPr>
+          <w:sz w:val="14"/>
+          <w:szCs w:val="14"/>
+          <w:lang w:val="fr-FR"/>
+        </w:rPr>
+        <w:t>les frais des actes extra-judiciaires et autres frais de justice motivés par des infractions aux clauses et aux conditions du présent engagement.</w:t>
+      </w:r>
+    </w:p>
+    <w:p>
+      <w:pPr>
+        <w:jc w:val="both"/>
+        <w:rPr>
+          <w:sz w:val="14"/>
+          <w:szCs w:val="14"/>
+          <w:lang w:val="fr-FR"/>
+        </w:rPr>
+      </w:pPr>
+      <w:r>
+        <w:rPr>
+          <w:sz w:val="14"/>
+          <w:szCs w:val="14"/>
+          <w:lang w:val="fr-FR"/>
+        </w:rPr>
+        <w:t xml:space="preserve">En application de ces principes et pour le cas où le recouvrement de toutes les sommes exigibles en vertu des présentes nécessiterait l’intervention d’un huissier de justice et/ou d’un avocat, le domicilié devra également rembourser à </w:t>
+      </w:r>
+      <w:r>
+        <w:rPr>
+          <w:b/>
+          <w:bCs/>
+          <w:color w:val="32483B"/>
+          <w:sz w:val="14"/>
+          <w:szCs w:val="14"/>
+          <w:lang w:val="fr-FR"/>
+        </w:rPr>
+        <w:t xml:space="preserve">« </w:t>
+      </w:r>
+      <w:r>
+        <w:rPr>
+          <w:b/>
+          <w:bCs/>
+          <w:color w:val="32483B"/>
+          <w:sz w:val="14"/>
+          <w:szCs w:val="14"/>
+          <w:lang w:val="fr-FR"/>
+        </w:rPr>
+        <w:t>CENTIRIO SARLAU</w:t>
+      </w:r>
+      <w:r>
+        <w:rPr>
+          <w:b/>
+          <w:bCs/>
+          <w:color w:val="32483B"/>
+          <w:sz w:val="14"/>
+          <w:szCs w:val="14"/>
+          <w:lang w:val="fr-FR"/>
+        </w:rPr>
+        <w:t xml:space="preserve"> »</w:t>
+      </w:r>
+      <w:r>
+        <w:rPr>
+          <w:sz w:val="14"/>
+          <w:szCs w:val="14"/>
+          <w:lang w:val="fr-FR"/>
+        </w:rPr>
+        <w:t>, les honoraires et frais de recouvrement, droit de recette ou droit proportionnel qui seraient perçus par ceux-ci.</w:t>
+      </w:r>
+    </w:p>
+    <w:p>
+      <w:pPr>
+        <w:jc w:val="both"/>
+        <w:rPr>
+          <w:b/>
+          <w:bCs/>
+          <w:sz w:val="14"/>
+          <w:szCs w:val="14"/>
+          <w:u w:val="single"/>
+          <w:lang w:val="fr-FR"/>
+        </w:rPr>
+      </w:pPr>
+      <w:r>
+        <w:rPr>
+          <w:b/>
+          <w:bCs/>
+          <w:sz w:val="14"/>
+          <w:szCs w:val="14"/>
+          <w:u w:val="single"/>
+          <w:lang w:val="fr-FR"/>
+        </w:rPr>
+        <w:t xml:space="preserve">ARTICLE </w:t>
+      </w:r>
+      <w:r>
+        <w:rPr>
+          <w:b/>
+          <w:bCs/>
+          <w:sz w:val="14"/>
+          <w:szCs w:val="14"/>
+          <w:u w:val="single"/>
+          <w:lang w:val="fr-FR"/>
+        </w:rPr>
+        <w:t>8</w:t>
+      </w:r>
+      <w:r>
+        <w:rPr>
+          <w:b/>
+          <w:bCs/>
+          <w:sz w:val="14"/>
+          <w:szCs w:val="14"/>
+          <w:u w:val="single"/>
+          <w:lang w:val="fr-FR"/>
+        </w:rPr>
+        <w:t xml:space="preserve"> : FRAIS</w:t>
+      </w:r>
+    </w:p>
+    <w:p>
+      <w:pPr>
+        <w:jc w:val="both"/>
+        <w:rPr>
+          <w:sz w:val="14"/>
+          <w:szCs w:val="14"/>
+          <w:lang w:val="fr-FR"/>
+        </w:rPr>
+      </w:pPr>
+      <w:r>
+        <w:rPr>
+          <w:sz w:val="14"/>
+          <w:szCs w:val="14"/>
+          <w:lang w:val="fr-FR"/>
+        </w:rPr>
+        <w:t>Les frais et droits des présentes sont à la charge du domicilié.</w:t>
+      </w:r>
+    </w:p>
+    <w:p>
+      <w:pPr>
+        <w:jc w:val="both"/>
+        <w:rPr>
+          <w:b/>
+          <w:bCs/>
+          <w:sz w:val="14"/>
+          <w:szCs w:val="14"/>
+          <w:u w:val="single"/>
+          <w:lang w:val="fr-FR"/>
+        </w:rPr>
+      </w:pPr>
+      <w:r>
+        <w:rPr>
+          <w:b/>
+          <w:bCs/>
+          <w:sz w:val="14"/>
+          <w:szCs w:val="14"/>
+          <w:u w:val="single"/>
+          <w:lang w:val="fr-FR"/>
+        </w:rPr>
+        <w:t>ARTICLE 9 : CLAUSE COMPROMISSOIRE</w:t>
+      </w:r>
+    </w:p>
+    <w:p>
+      <w:pPr>
+        <w:jc w:val="both"/>
+        <w:rPr>
+          <w:sz w:val="14"/>
+          <w:szCs w:val="14"/>
+          <w:lang w:val="fr-FR"/>
+        </w:rPr>
+      </w:pPr>
+      <w:r>
+        <w:rPr>
+          <w:sz w:val="14"/>
+          <w:szCs w:val="14"/>
+          <w:lang w:val="fr-FR"/>
+        </w:rPr>
+        <w:t>En cas de contestation ou de litige quant à l’exécution des présentes, les Parties s’entendent pour rendre le Tribunal de Casablanca seul compétent.</w:t>
+      </w:r>
+    </w:p>
+    <w:p>
+      <w:pPr>
+        <w:jc w:val="both"/>
+        <w:rPr>
+          <w:b/>
+          <w:bCs/>
+          <w:sz w:val="14"/>
+          <w:szCs w:val="14"/>
+          <w:u w:val="single"/>
+          <w:lang w:val="fr-FR"/>
+        </w:rPr>
+      </w:pPr>
+      <w:r>
+        <w:rPr>
+          <w:b/>
+          <w:bCs/>
+          <w:sz w:val="14"/>
+          <w:szCs w:val="14"/>
+          <w:u w:val="single"/>
+          <w:lang w:val="fr-FR"/>
+        </w:rPr>
+        <w:t>ARTICLE 1</w:t>
+      </w:r>
+      <w:r>
+        <w:rPr>
+          <w:b/>
+          <w:bCs/>
+          <w:sz w:val="14"/>
+          <w:szCs w:val="14"/>
+          <w:u w:val="single"/>
+          <w:lang w:val="fr-FR"/>
+        </w:rPr>
+        <w:t>0</w:t>
+      </w:r>
+      <w:r>
+        <w:rPr>
+          <w:b/>
+          <w:bCs/>
+          <w:sz w:val="14"/>
+          <w:szCs w:val="14"/>
+          <w:u w:val="single"/>
+          <w:lang w:val="fr-FR"/>
+        </w:rPr>
+        <w:t xml:space="preserve"> : PROCURATION SPECIALE :</w:t>
+      </w:r>
+    </w:p>
+    <w:p>
+      <w:pPr>
+        <w:jc w:val="both"/>
+        <w:rPr>
+          <w:sz w:val="14"/>
+          <w:szCs w:val="14"/>
+          <w:lang w:val="fr-FR"/>
+        </w:rPr>
+      </w:pPr>
+      <w:r>
+        <w:rPr>
+          <w:b/>
+          <w:bCs/>
           <w:color w:val="0E2841" w:themeColor="text2"/>
           <w:sz w:val="14"/>
           <w:szCs w:val="14"/>
           <w:lang w:val="fr-FR"/>
         </w:rPr>
+        <w:t>{{CIVIL}} {{PRENOM}} {{NOM}},</w:t>
+      </w:r>
+      <w:r>
+        <w:rPr>
+          <w:color w:val="0E2841" w:themeColor="text2"/>
+          <w:sz w:val="14"/>
+          <w:szCs w:val="14"/>
+          <w:lang w:val="fr-FR"/>
+        </w:rPr>
         <w:t xml:space="preserve"> </w:t>
       </w:r>
       <w:r>
@@ -3170,10 +4457,52 @@
           <w:szCs w:val="14"/>
           <w:lang w:val="fr-FR"/>
         </w:rPr>
-        <w:t>« {{ DENOMINATION_SOCIALE }} {{ FORME_JURIDIQUE }} »</w:t>
-      </w:r>
-      <w:r>
-        <w:rPr>
+        <w:t>« {{DEN_STE}} {{FORME_JUR}} »</w:t>
+      </w:r>
+      <w:r>
+        <w:rPr>
+          <w:sz w:val="14"/>
+          <w:szCs w:val="14"/>
+          <w:lang w:val="fr-FR"/>
+        </w:rPr>
+        <w:t xml:space="preserve">, donne procuration à la Société </w:t>
+      </w:r>
+      <w:r>
+        <w:rPr>
+          <w:b/>
+          <w:bCs/>
+          <w:color w:val="32483B"/>
+          <w:sz w:val="14"/>
+          <w:szCs w:val="14"/>
+          <w:lang w:val="fr-FR"/>
+        </w:rPr>
+        <w:t xml:space="preserve">« </w:t>
+      </w:r>
+      <w:r>
+        <w:rPr>
+          <w:b/>
+          <w:bCs/>
+          <w:color w:val="32483B"/>
+          <w:sz w:val="14"/>
+          <w:szCs w:val="14"/>
+          <w:lang w:val="fr-FR"/>
+        </w:rPr>
+        <w:t>CENTIRIO SARLAU</w:t>
+      </w:r>
+      <w:r>
+        <w:rPr>
+          <w:b/>
+          <w:bCs/>
+          <w:color w:val="32483B"/>
+          <w:sz w:val="14"/>
+          <w:szCs w:val="14"/>
+          <w:lang w:val="fr-FR"/>
+        </w:rPr>
+        <w:t xml:space="preserve"> »</w:t>
+      </w:r>
+      <w:r>
+        <w:rPr>
+          <w:color w:val="124F1A" w:themeColor="accent3" w:themeShade="BF"/>
           <w:sz w:val="14"/>
           <w:szCs w:val="14"/>
           <w:lang w:val="fr-FR"/>
@@ -3186,56 +4515,6 @@
           <w:szCs w:val="14"/>
           <w:lang w:val="fr-FR"/>
         </w:rPr>
-        <w:t xml:space="preserve">donne procuration à la Société </w:t>
-      </w:r>
-      <w:r>
-        <w:rPr>
-          <w:b/>
-          <w:bCs/>
-          <w:color w:val="124F1A" w:themeColor="accent3" w:themeShade="BF"/>
-          <w:sz w:val="14"/>
-          <w:szCs w:val="14"/>
-          <w:lang w:val="fr-FR"/>
-        </w:rPr>
-        <w:t xml:space="preserve">« </w:t>
-      </w:r>
-      <w:r>
-        <w:rPr>
-          <w:b/>
-          <w:bCs/>
-          <w:color w:val="124F1A" w:themeColor="accent3" w:themeShade="BF"/>
-          <w:sz w:val="14"/>
-          <w:szCs w:val="14"/>
-          <w:lang w:val="fr-FR"/>
-        </w:rPr>
-        <w:t>CENTIRIO</w:t>
-      </w:r>
-      <w:r>
-        <w:rPr>
-          <w:b/>
-          <w:bCs/>
-          <w:color w:val="124F1A" w:themeColor="accent3" w:themeShade="BF"/>
-          <w:sz w:val="14"/>
-          <w:szCs w:val="14"/>
-          <w:lang w:val="fr-FR"/>
-        </w:rPr>
-        <w:t xml:space="preserve"> SARL »</w:t>
-      </w:r>
-      <w:r>
-        <w:rPr>
-          <w:color w:val="124F1A" w:themeColor="accent3" w:themeShade="BF"/>
-          <w:sz w:val="14"/>
-          <w:szCs w:val="14"/>
-          <w:lang w:val="fr-FR"/>
-        </w:rPr>
-        <w:t xml:space="preserve">, </w:t>
-      </w:r>
-      <w:r>
-        <w:rPr>
-          <w:sz w:val="14"/>
-          <w:szCs w:val="14"/>
-          <w:lang w:val="fr-FR"/>
-        </w:rPr>
         <w:t xml:space="preserve">pour   la   réception   de   tous   courriers   ou   notifications   au   nom   de   la   société </w:t>
       </w:r>
       <w:r>
@@ -3247,7 +4526,7 @@
           <w:szCs w:val="14"/>
           <w:lang w:val="fr-FR"/>
         </w:rPr>
-        <w:t>{{ DENOMINATION_SOCIALE }} {{ FORME_JURIDIQUE }}.</w:t>
+        <w:t>{{DEN_STE}} {{FORME_JUR}}.</w:t>
       </w:r>
     </w:p>
     <w:p>
@@ -3270,6 +4549,7 @@
     </w:p>
     <w:p>
       <w:pPr>
+        <w:spacing w:after="0"/>
         <w:jc w:val="both"/>
         <w:rPr>
           <w:b/>
@@ -3529,6 +4809,7 @@
         </w:rPr>
         <w:t xml:space="preserve">Le : </w:t>
       </w:r>
+      <w:proofErr w:type="gramStart"/>
       <w:r>
         <w:rPr>
           <w:b/>
@@ -3538,7 +4819,43 @@
           <w:szCs w:val="14"/>
           <w:lang w:val="fr-FR"/>
         </w:rPr>
-        <w:t>{{ DATE_CONTRAT }}</w:t>
+        <w:t>{{ DATE</w:t>
+      </w:r>
+      <w:proofErr w:type="gramEnd"/>
+      <w:r>
+        <w:rPr>
+          <w:b/>
+          <w:bCs/>
+          <w:color w:val="002060"/>
+          <w:sz w:val="14"/>
+          <w:szCs w:val="14"/>
+          <w:lang w:val="fr-FR"/>
+        </w:rPr>
+        <w:t>_</w:t>
+      </w:r>
+      <w:proofErr w:type="gramStart"/>
+      <w:r>
+        <w:rPr>
+          <w:b/>
+          <w:bCs/>
+          <w:color w:val="002060"/>
+          <w:sz w:val="14"/>
+          <w:szCs w:val="14"/>
+          <w:lang w:val="fr-FR"/>
+        </w:rPr>
+        <w:t>CONTRAT }</w:t>
+      </w:r>
+      <w:proofErr w:type="gramEnd"/>
+      <w:r>
+        <w:rPr>
+          <w:b/>
+          <w:bCs/>
+          <w:color w:val="002060"/>
+          <w:sz w:val="14"/>
+          <w:szCs w:val="14"/>
+          <w:lang w:val="fr-FR"/>
+        </w:rPr>
+        <w:t>}</w:t>
       </w:r>
     </w:p>
     <w:p>

</xml_diff>